<commit_message>
vistoria: corrige checklist e combustivel para novo template
- Restaurar placeholders [  ] no VISTORIA_TESTE_1.docx (usuario havia preenchido manualmente)
- Remapear checklist para estrutura 15x22 do novo template
- Escrever [x] direto na celula ([ ] fragmentado em multiplos w:t)
- Corrigir combustivel: regex direta no w:t unico, fallback multi-elemento

Co-Authored-By: Claude Sonnet 4.6 <noreply@anthropic.com>
</commit_message>
<xml_diff>
--- a/docx_templates/VISTORIA_TESTE_1.docx
+++ b/docx_templates/VISTORIA_TESTE_1.docx
@@ -197,7 +197,7 @@
               </w:rPr>
             </w:pPr>
             <w:r>
-              <w:t>Joao da Silva</w:t>
+              <w:t>[  ]</w:t>
             </w:r>
           </w:p>
         </w:tc>
@@ -252,7 +252,7 @@
           </w:tcPr>
           <w:p>
             <w:r>
-              <w:t>Carlos</w:t>
+              <w:t>[  ]</w:t>
             </w:r>
           </w:p>
         </w:tc>
@@ -324,7 +324,7 @@
               </w:rPr>
             </w:pPr>
             <w:r>
-              <w:t>Rua Aeroporto Cataratas do Iguaçu, 71</w:t>
+              <w:t>[  ]</w:t>
             </w:r>
           </w:p>
         </w:tc>
@@ -379,7 +379,7 @@
           </w:tcPr>
           <w:p>
             <w:r>
-              <w:t>(84)9 8808-4415</w:t>
+              <w:t>[  ]</w:t>
             </w:r>
           </w:p>
         </w:tc>
@@ -441,7 +441,7 @@
               </w:rPr>
             </w:pPr>
             <w:r>
-              <w:t>9BWZZZ377</w:t>
+              <w:t>[  ]</w:t>
             </w:r>
           </w:p>
         </w:tc>
@@ -496,7 +496,7 @@
           </w:tcPr>
           <w:p>
             <w:r>
-              <w:t>ABC123</w:t>
+              <w:t>[  ]</w:t>
             </w:r>
           </w:p>
         </w:tc>
@@ -558,7 +558,7 @@
               </w:rPr>
             </w:pPr>
             <w:r>
-              <w:t>Fiat Uno</w:t>
+              <w:t>[  ]</w:t>
             </w:r>
           </w:p>
         </w:tc>
@@ -613,7 +613,7 @@
           </w:tcPr>
           <w:p>
             <w:r>
-              <w:t>YHU-8520</w:t>
+              <w:t>[  ]</w:t>
             </w:r>
           </w:p>
         </w:tc>
@@ -675,7 +675,7 @@
               </w:rPr>
             </w:pPr>
             <w:r>
-              <w:t>2020</w:t>
+              <w:t>[  ]</w:t>
             </w:r>
           </w:p>
         </w:tc>
@@ -730,7 +730,7 @@
           </w:tcPr>
           <w:p>
             <w:r>
-              <w:t>Preto</w:t>
+              <w:t>[  ]</w:t>
             </w:r>
           </w:p>
         </w:tc>
@@ -792,7 +792,7 @@
               </w:rPr>
             </w:pPr>
             <w:r>
-              <w:t>45000</w:t>
+              <w:t>[  ]</w:t>
             </w:r>
           </w:p>
         </w:tc>
@@ -847,7 +847,7 @@
           </w:tcPr>
           <w:p>
             <w:r>
-              <w:t>45500</w:t>
+              <w:t>[  ]</w:t>
             </w:r>
           </w:p>
         </w:tc>
@@ -915,7 +915,7 @@
               </w:rPr>
             </w:pPr>
             <w:r>
-              <w:t>[x] MT [  ] 6/8 [  ] TC</w:t>
+              <w:t>[  ] MT [  ] 6/8 [  ] TC</w:t>
             </w:r>
           </w:p>
         </w:tc>
@@ -983,7 +983,7 @@
           </w:tcPr>
           <w:p>
             <w:r>
-              <w:t>15/04/2026</w:t>
+              <w:t>[  ]</w:t>
             </w:r>
           </w:p>
         </w:tc>

</xml_diff>